<commit_message>
Warn before deleting a class, and say what deleting it does
Delete used to turn into "Confirm" in place and say nothing more, which
reads as a second press of the same button: two quick clicks removed a
class of thirty without a word. It now opens a dialog that names the class
and how many students are in it, says it cannot be undone, and spells out
what survives: the students stay on the roster with their results, and
assessments already assigned to them stay assigned (listed). Only "Yes,
delete <class>" deletes.

Co-Authored-By: Claude Opus 5.5 <noreply@anthropic.com>
</commit_message>
<xml_diff>
--- a/instructions/MCQ Teacher Guide.docx
+++ b/instructions/MCQ Teacher Guide.docx
@@ -170,6 +170,14 @@
       </w:pPr>
       <w:r>
         <w:t>A student is in one class at a time: moving them takes them out of your other classes.</w:t>
+      </w:r>
+    </w:p>
+    <w:p>
+      <w:pPr>
+        <w:pStyle w:val="ListBullet"/>
+      </w:pPr>
+      <w:r>
+        <w:t>Rename or delete - rename a class, or delete it. Delete asks first and says what will happen: the class goes, its students stay on your roster with every result, and assessments already assigned to them stay assigned. It cannot be undone.</w:t>
       </w:r>
     </w:p>
     <w:p>

</xml_diff>